<commit_message>
Document community collection demo
</commit_message>
<xml_diff>
--- a/Documents and Learning/Project_Overview_and_Learning_Plan.docx
+++ b/Documents and Learning/Project_Overview_and_Learning_Plan.docx
@@ -1118,7 +1118,7 @@
         <w:spacing w:after="60"/>
       </w:pPr>
       <w:r>
-        <w:t>All code and files created so far are practice prototypes. They are not the official submission and have not been uploaded to GitHub.</w:t>
+        <w:t>All code and files created so far are practice prototypes, not the official submission. Keep them separate from the official version once that work begins.</w:t>
       </w:r>
     </w:p>
     <w:p>
@@ -1159,10 +1159,51 @@
     </w:p>
     <w:p>
       <w:pPr>
+        <w:pStyle w:val="ListBullet"/>
+        <w:spacing w:after="60"/>
+      </w:pPr>
+      <w:r>
+        <w:t>The community demo uses shared household collection points: nearby homes pool small contributions before one pickup request is submitted. This does not remove BR-04; the combined request must still reach 5 kg.</w:t>
+      </w:r>
+    </w:p>
+    <w:p>
+      <w:pPr>
+        <w:pStyle w:val="ListBullet"/>
+        <w:spacing w:after="60"/>
+      </w:pPr>
+      <w:r>
+        <w:t>The five holdout requests are not hidden computer files. They are R016-R020 in community_demo/requests.csv; only their expected answers are withheld from the visible answer file.</w:t>
+      </w:r>
+    </w:p>
+    <w:p>
+      <w:pPr>
         <w:pStyle w:val="Heading1"/>
       </w:pPr>
       <w:r>
-        <w:t>7. Planned next steps</w:t>
+        <w:t>7. Community collection demo</w:t>
+      </w:r>
+    </w:p>
+    <w:p>
+      <w:r>
+        <w:t>The larger learning demo has 15 sources: 9 shared household collection points across 3 residential areas and 6 BULK locations. It contains 20 requests for one illustrative month. The first 15 have visible expected output; the last 5 are practice holdouts. The values and rate card are synthetic examples, not measured local data.</w:t>
+      </w:r>
+    </w:p>
+    <w:p>
+      <w:r>
+        <w:t>The first seven visible requests total 1,150 kg over 7 stops. The next 60 kg request cannot fit that day, so it moves to Day 2. Later, the scheduler may still place a request on an earlier day if all stop, weight, and hazardous limits fit. The visible monthly summary also demonstrates a certificate when one source reaches 550 kg.</w:t>
+      </w:r>
+    </w:p>
+    <w:p>
+      <w:r>
+        <w:t>To read the terminal report more easily, run the command with --friendly. It prints full source names and labels each value. The compact report remains available for comparison with the assignment's exact-output expectations.</w:t>
+      </w:r>
+    </w:p>
+    <w:p>
+      <w:pPr>
+        <w:pStyle w:val="Heading1"/>
+      </w:pPr>
+      <w:r>
+        <w:t>8. Planned next steps</w:t>
       </w:r>
     </w:p>
     <w:p>
@@ -1171,7 +1212,7 @@
         <w:spacing w:after="60"/>
       </w:pPr>
       <w:r>
-        <w:t>Continue learning the demo code line by line, starting with its data classes and CSV loading.</w:t>
+        <w:t>Continue learning the demo code line by line, starting with its data classes and CSV loading; practice reading the friendly report.</w:t>
       </w:r>
     </w:p>
     <w:p>
@@ -1265,7 +1306,7 @@
         <w:color w:val="617080"/>
         <w:sz w:val="16"/>
       </w:rPr>
-      <w:t>ECE-055  |  Learning brief  |  16 October 2026</w:t>
+      <w:t>ECE-055  |  Learning brief  |  22 October 2026</w:t>
     </w:r>
   </w:p>
 </w:ftr>

</xml_diff>